<commit_message>
Apply second-pass curriculum revisions to source DOCX files
Based on supervisor audit (2026-07-21):

Resolved:
- MS 1-1: 'Good nutrition=' -> 'can support' language, pre-assessment label
- MS 1-2: Fruit quiz question fixed (fresh vs frozen nuance)
- MS 1-3: Dairy language neutralized, 21-meal activity reduced, 'control calories' removed
- MS 1-6: Protein removed from universal increase list, granola question reframed
- MS 1-7: Ingredient bias fixed, 'red flags' -> 'check for'
- MS 2-2: Urine color no longer 'best' measure
- MS 2-4: 6-8 cup universal answer fixed, kidney stones/UTI context, sports drinks qualified
- HS 1-3: Mineral claims corrected
- HS 2-1: Wellness marketing removed from micronutrient claims
- HS 2-2: Vitamin A/D/E promises replaced with established functions
- HS 2-4: Multifactorial cramp explanation
- HS 4-3, 4-6, 5-1, 6-2, 6-3: Tracking/self-diagnosis risks removed
</commit_message>
<xml_diff>
--- a/source/hs/Course 2_ Micronutrients/Lesson 1.docx
+++ b/source/hs/Course 2_ Micronutrients/Lesson 1.docx
@@ -691,21 +691,51 @@
       </w:pPr>
       <w:r>
         <w:rPr>
+          <w:b/>
+          <w:bCs w:val="1"/>
+          <w:sz w:val="24"/>
+          <w:szCs w:val="24"/>
+          <w:rtl w:val="0"/>
+        </w:rPr>
+        <w:t>Vitamin A supports normal vision and immune function</w:t>
+      </w:r>
+      <w:r>
+        <w:rPr>
+          <w:sz w:val="24"/>
+          <w:szCs w:val="24"/>
+          <w:rtl w:val="0"/>
+        </w:rPr>
+      </w:r>
+    </w:p>
+    <w:p>
+      <w:pPr>
+        <w:numPr>
+          <w:ilvl w:val="0"/>
+          <w:numId w:val="25"/>
+        </w:numPr>
+        <w:spacing w:after="0" w:afterAutospacing="0" w:before="0" w:beforeAutospacing="0" w:lineRule="auto"/>
+        <w:ind w:left="720" w:hanging="360"/>
+        <w:rPr>
+          <w:sz w:val="24"/>
+          <w:szCs w:val="24"/>
+        </w:rPr>
+      </w:pPr>
+      <w:r>
+        <w:rPr>
           <w:b w:val="1"/>
           <w:bCs w:val="1"/>
           <w:sz w:val="24"/>
           <w:szCs w:val="24"/>
           <w:rtl w:val="0"/>
         </w:rPr>
-        <w:t xml:space="preserve">Vitamin A</w:t>
-      </w:r>
-      <w:r>
-        <w:rPr>
-          <w:sz w:val="24"/>
-          <w:szCs w:val="24"/>
-          <w:rtl w:val="0"/>
-        </w:rPr>
-        <w:t xml:space="preserve"> keeps your eyesight sharp (crucial for school and driving) and supports your immune system so you don't get sick as often</w:t>
+        <w:t>Vitamin D helps the body absorb calcium for normal bone health</w:t>
+      </w:r>
+      <w:r>
+        <w:rPr>
+          <w:sz w:val="24"/>
+          <w:szCs w:val="24"/>
+          <w:rtl w:val="0"/>
+        </w:rPr>
       </w:r>
     </w:p>
     <w:p>
@@ -723,53 +753,20 @@
       </w:pPr>
       <w:r>
         <w:rPr>
-          <w:b w:val="1"/>
+          <w:b/>
           <w:bCs w:val="1"/>
           <w:sz w:val="24"/>
           <w:szCs w:val="24"/>
           <w:rtl w:val="0"/>
         </w:rPr>
-        <w:t xml:space="preserve">Vitamin D</w:t>
-      </w:r>
-      <w:r>
-        <w:rPr>
-          <w:sz w:val="24"/>
-          <w:szCs w:val="24"/>
-          <w:rtl w:val="0"/>
-        </w:rPr>
-        <w:t xml:space="preserve"> helps your bones stay strong (important if you're athletic or want to avoid injuries) and actually affects your mood—lack of it can make you feel depressed or unmotivated</w:t>
-      </w:r>
-    </w:p>
-    <w:p>
-      <w:pPr>
-        <w:numPr>
-          <w:ilvl w:val="0"/>
-          <w:numId w:val="25"/>
-        </w:numPr>
-        <w:spacing w:after="0" w:afterAutospacing="0" w:before="0" w:beforeAutospacing="0" w:lineRule="auto"/>
-        <w:ind w:left="720" w:hanging="360"/>
-        <w:rPr>
-          <w:sz w:val="24"/>
-          <w:szCs w:val="24"/>
-        </w:rPr>
-      </w:pPr>
-      <w:r>
-        <w:rPr>
-          <w:b w:val="1"/>
-          <w:bCs w:val="1"/>
-          <w:sz w:val="24"/>
-          <w:szCs w:val="24"/>
-          <w:rtl w:val="0"/>
-        </w:rPr>
-        <w:t xml:space="preserve">Vitamin E</w:t>
-      </w:r>
-      <w:r>
-        <w:rPr>
-          <w:sz w:val="24"/>
-          <w:szCs w:val="24"/>
-          <w:rtl w:val="0"/>
-        </w:rPr>
-        <w:t xml:space="preserve"> protects your skin from damage, which is why dermatologists recommend it for clear, healthy skin</w:t>
+        <w:t>Vitamin E acts as an antioxidant and supports normal cell function</w:t>
+      </w:r>
+      <w:r>
+        <w:rPr>
+          <w:sz w:val="24"/>
+          <w:szCs w:val="24"/>
+          <w:rtl w:val="0"/>
+        </w:rPr>
       </w:r>
     </w:p>
     <w:p>
@@ -848,53 +845,51 @@
       </w:pPr>
       <w:r>
         <w:rPr>
+          <w:b/>
+          <w:bCs w:val="1"/>
+          <w:sz w:val="24"/>
+          <w:szCs w:val="24"/>
+          <w:rtl w:val="0"/>
+        </w:rPr>
+        <w:t>Vitamin C supports normal immune function and tissue repair</w:t>
+      </w:r>
+      <w:r>
+        <w:rPr>
+          <w:sz w:val="24"/>
+          <w:szCs w:val="24"/>
+          <w:rtl w:val="0"/>
+        </w:rPr>
+      </w:r>
+    </w:p>
+    <w:p>
+      <w:pPr>
+        <w:numPr>
+          <w:ilvl w:val="0"/>
+          <w:numId w:val="23"/>
+        </w:numPr>
+        <w:spacing w:after="240" w:before="0" w:beforeAutospacing="0" w:lineRule="auto"/>
+        <w:ind w:left="720" w:hanging="360"/>
+        <w:rPr>
+          <w:sz w:val="24"/>
+          <w:szCs w:val="24"/>
+        </w:rPr>
+      </w:pPr>
+      <w:r>
+        <w:rPr>
           <w:b w:val="1"/>
           <w:bCs w:val="1"/>
           <w:sz w:val="24"/>
           <w:szCs w:val="24"/>
           <w:rtl w:val="0"/>
         </w:rPr>
-        <w:t xml:space="preserve">Vitamin C</w:t>
-      </w:r>
-      <w:r>
-        <w:rPr>
-          <w:sz w:val="24"/>
-          <w:szCs w:val="24"/>
-          <w:rtl w:val="0"/>
-        </w:rPr>
-        <w:t xml:space="preserve"> boosts your immune system (fewer sick days = more time with friends and better grades), helps your skin look clear, and gives you energy</w:t>
-      </w:r>
-    </w:p>
-    <w:p>
-      <w:pPr>
-        <w:numPr>
-          <w:ilvl w:val="0"/>
-          <w:numId w:val="23"/>
-        </w:numPr>
-        <w:spacing w:after="240" w:before="0" w:beforeAutospacing="0" w:lineRule="auto"/>
-        <w:ind w:left="720" w:hanging="360"/>
-        <w:rPr>
-          <w:sz w:val="24"/>
-          <w:szCs w:val="24"/>
-        </w:rPr>
-      </w:pPr>
-      <w:r>
-        <w:rPr>
-          <w:b w:val="1"/>
-          <w:bCs w:val="1"/>
-          <w:sz w:val="24"/>
-          <w:szCs w:val="24"/>
-          <w:rtl w:val="0"/>
-        </w:rPr>
-        <w:t xml:space="preserve">B-Complex Vitamins</w:t>
-      </w:r>
-      <w:r>
-        <w:rPr>
-          <w:sz w:val="24"/>
-          <w:szCs w:val="24"/>
-          <w:rtl w:val="0"/>
-        </w:rPr>
-        <w:t xml:space="preserve"> are basically your brain's best friend—they help you focus in class, regulate your mood, and convert food into the energy you need to power through your day</w:t>
+        <w:t>B-Complex Vitamins support normal energy metabolism and nervous system function</w:t>
+      </w:r>
+      <w:r>
+        <w:rPr>
+          <w:sz w:val="24"/>
+          <w:szCs w:val="24"/>
+          <w:rtl w:val="0"/>
+        </w:rPr>
       </w:r>
     </w:p>
     <w:p>

</xml_diff>